<commit_message>
feat(empresarial): Adicionar benefícios — vários procedimentos de uma vez, mesmas regras (v0.89.0)
- Janela "Novos benefícios": caixinhas por especialidade (só os sem
  benefício), busca, "Marcar todos" por bloco, escolhidos com ×, regras
  preenchidas uma vez; grava todos num INSERT só (todos ou nenhum) e recusa
  se algum marcado já ganhou benefício.
- Corrige a janela que transbordava com nome comprido de procedimento.
- Editar continua um por vez; regras num componente só (CamposDaRegra).
- Manual §15 e Word atualizados.

Co-Authored-By: Claude Opus 5.5 <noreply@anthropic.com>
</commit_message>
<xml_diff>
--- a/docs/treinamento/Manual-Risarte-Empresarial.docx
+++ b/docs/treinamento/Manual-Risarte-Empresarial.docx
@@ -180,7 +180,7 @@
           <w:sz w:val="20"/>
           <w:szCs w:val="20"/>
         </w:rPr>
-        <w:t xml:space="preserve">27 de outubro de 2026</w:t>
+        <w:t xml:space="preserve">28 de outubro de 2026</w:t>
       </w:r>
     </w:p>
     <w:p>
@@ -22098,61 +22098,218 @@
           <w:sz w:val="21"/>
           <w:szCs w:val="21"/>
         </w:rPr>
-        <w:t xml:space="preserve">. Em </w:t>
-      </w:r>
-      <w:r>
-        <w:rPr>
-          <w:b/>
-          <w:bCs/>
-          <w:color w:val="23293D"/>
-          <w:sz w:val="21"/>
-          <w:szCs w:val="21"/>
-        </w:rPr>
-        <w:t xml:space="preserve">Adicionar benefício</w:t>
-      </w:r>
-      <w:r>
-        <w:rPr>
-          <w:color w:val="23293D"/>
-          <w:sz w:val="21"/>
-          <w:szCs w:val="21"/>
-        </w:rPr>
-        <w:t xml:space="preserve">, a lista tem </w:t>
-      </w:r>
-      <w:r>
-        <w:rPr>
-          <w:b/>
-          <w:bCs/>
-          <w:color w:val="23293D"/>
-          <w:sz w:val="21"/>
-          <w:szCs w:val="21"/>
-        </w:rPr>
-        <w:t xml:space="preserve">busca</w:t>
-      </w:r>
-      <w:r>
-        <w:rPr>
-          <w:color w:val="23293D"/>
-          <w:sz w:val="21"/>
-          <w:szCs w:val="21"/>
-        </w:rPr>
-        <w:t xml:space="preserve"> (digite parte do nome) e mostra </w:t>
-      </w:r>
-      <w:r>
-        <w:rPr>
-          <w:b/>
-          <w:bCs/>
-          <w:color w:val="23293D"/>
-          <w:sz w:val="21"/>
-          <w:szCs w:val="21"/>
-        </w:rPr>
-        <w:t xml:space="preserve">só os procedimentos que ainda não têm benefício</w:t>
-      </w:r>
-      <w:r>
-        <w:rPr>
-          <w:color w:val="23293D"/>
-          <w:sz w:val="21"/>
-          <w:szCs w:val="21"/>
-        </w:rPr>
-        <w:t xml:space="preserve">; para mudar um que já tem, use o </w:t>
+        <w:t xml:space="preserve">. </w:t>
+      </w:r>
+      <w:r>
+        <w:rPr>
+          <w:b/>
+          <w:bCs/>
+          <w:color w:val="23293D"/>
+          <w:sz w:val="21"/>
+          <w:szCs w:val="21"/>
+        </w:rPr>
+        <w:t xml:space="preserve">Adicionar benefícios</w:t>
+      </w:r>
+      <w:r>
+        <w:rPr>
+          <w:color w:val="23293D"/>
+          <w:sz w:val="21"/>
+          <w:szCs w:val="21"/>
+        </w:rPr>
+        <w:t xml:space="preserve"> inclui </w:t>
+      </w:r>
+      <w:r>
+        <w:rPr>
+          <w:b/>
+          <w:bCs/>
+          <w:color w:val="23293D"/>
+          <w:sz w:val="21"/>
+          <w:szCs w:val="21"/>
+        </w:rPr>
+        <w:t xml:space="preserve">vários procedimentos de uma vez</w:t>
+      </w:r>
+      <w:r>
+        <w:rPr>
+          <w:color w:val="23293D"/>
+          <w:sz w:val="21"/>
+          <w:szCs w:val="21"/>
+        </w:rPr>
+        <w:t xml:space="preserve">, com as mesmas regras: 1. </w:t>
+      </w:r>
+      <w:r>
+        <w:rPr>
+          <w:b/>
+          <w:bCs/>
+          <w:color w:val="23293D"/>
+          <w:sz w:val="21"/>
+          <w:szCs w:val="21"/>
+        </w:rPr>
+        <w:t xml:space="preserve">Marque os procedimentos.</w:t>
+      </w:r>
+      <w:r>
+        <w:rPr>
+          <w:color w:val="23293D"/>
+          <w:sz w:val="21"/>
+          <w:szCs w:val="21"/>
+        </w:rPr>
+        <w:t xml:space="preserve"> A lista mostra </w:t>
+      </w:r>
+      <w:r>
+        <w:rPr>
+          <w:b/>
+          <w:bCs/>
+          <w:color w:val="23293D"/>
+          <w:sz w:val="21"/>
+          <w:szCs w:val="21"/>
+        </w:rPr>
+        <w:t xml:space="preserve">só os que ainda não têm benefício</w:t>
+      </w:r>
+      <w:r>
+        <w:rPr>
+          <w:color w:val="23293D"/>
+          <w:sz w:val="21"/>
+          <w:szCs w:val="21"/>
+        </w:rPr>
+        <w:t xml:space="preserve">, separados por especialidade e com o preço ao lado; o campo </w:t>
+      </w:r>
+      <w:r>
+        <w:rPr>
+          <w:b/>
+          <w:bCs/>
+          <w:color w:val="23293D"/>
+          <w:sz w:val="21"/>
+          <w:szCs w:val="21"/>
+        </w:rPr>
+        <w:t xml:space="preserve">Procurar</w:t>
+      </w:r>
+      <w:r>
+        <w:rPr>
+          <w:color w:val="23293D"/>
+          <w:sz w:val="21"/>
+          <w:szCs w:val="21"/>
+        </w:rPr>
+        <w:t xml:space="preserve"> filtra, e </w:t>
+      </w:r>
+      <w:r>
+        <w:rPr>
+          <w:b/>
+          <w:bCs/>
+          <w:color w:val="23293D"/>
+          <w:sz w:val="21"/>
+          <w:szCs w:val="21"/>
+        </w:rPr>
+        <w:t xml:space="preserve">Marcar todos</w:t>
+      </w:r>
+      <w:r>
+        <w:rPr>
+          <w:color w:val="23293D"/>
+          <w:sz w:val="21"/>
+          <w:szCs w:val="21"/>
+        </w:rPr>
+        <w:t xml:space="preserve"> pega a especialidade inteira (só o que está à vista, se houver busca). Os escolhidos aparecem embaixo, cada um com um </w:t>
+      </w:r>
+      <w:r>
+        <w:rPr>
+          <w:b/>
+          <w:bCs/>
+          <w:color w:val="23293D"/>
+          <w:sz w:val="21"/>
+          <w:szCs w:val="21"/>
+        </w:rPr>
+        <w:t xml:space="preserve">×</w:t>
+      </w:r>
+      <w:r>
+        <w:rPr>
+          <w:color w:val="23293D"/>
+          <w:sz w:val="21"/>
+          <w:szCs w:val="21"/>
+        </w:rPr>
+        <w:t xml:space="preserve"> para tirar, e </w:t>
+      </w:r>
+      <w:r>
+        <w:rPr>
+          <w:b/>
+          <w:bCs/>
+          <w:color w:val="23293D"/>
+          <w:sz w:val="21"/>
+          <w:szCs w:val="21"/>
+        </w:rPr>
+        <w:t xml:space="preserve">Limpar</w:t>
+      </w:r>
+      <w:r>
+        <w:rPr>
+          <w:color w:val="23293D"/>
+          <w:sz w:val="21"/>
+          <w:szCs w:val="21"/>
+        </w:rPr>
+        <w:t xml:space="preserve"> desmarca tudo. 2. </w:t>
+      </w:r>
+      <w:r>
+        <w:rPr>
+          <w:b/>
+          <w:bCs/>
+          <w:color w:val="23293D"/>
+          <w:sz w:val="21"/>
+          <w:szCs w:val="21"/>
+        </w:rPr>
+        <w:t xml:space="preserve">Preencha as regras uma vez</w:t>
+      </w:r>
+      <w:r>
+        <w:rPr>
+          <w:color w:val="23293D"/>
+          <w:sz w:val="21"/>
+          <w:szCs w:val="21"/>
+        </w:rPr>
+        <w:t xml:space="preserve"> — cobertura, desconto, usos, a cada (meses), carência e parcelas. Valem para todos os marcados. 3. Clique em </w:t>
+      </w:r>
+      <w:r>
+        <w:rPr>
+          <w:b/>
+          <w:bCs/>
+          <w:color w:val="23293D"/>
+          <w:sz w:val="21"/>
+          <w:szCs w:val="21"/>
+        </w:rPr>
+        <w:t xml:space="preserve">Adicionar N benefícios</w:t>
+      </w:r>
+      <w:r>
+        <w:rPr>
+          <w:color w:val="23293D"/>
+          <w:sz w:val="21"/>
+          <w:szCs w:val="21"/>
+        </w:rPr>
+        <w:t xml:space="preserve">. Entram </w:t>
+      </w:r>
+      <w:r>
+        <w:rPr>
+          <w:b/>
+          <w:bCs/>
+          <w:color w:val="23293D"/>
+          <w:sz w:val="21"/>
+          <w:szCs w:val="21"/>
+        </w:rPr>
+        <w:t xml:space="preserve">todos ou nenhum</w:t>
+      </w:r>
+      <w:r>
+        <w:rPr>
+          <w:color w:val="23293D"/>
+          <w:sz w:val="21"/>
+          <w:szCs w:val="21"/>
+        </w:rPr>
+        <w:t xml:space="preserve">: se algum dos marcados ganhou benefício nesse meio-tempo (outra pessoa incluiu), a tela recusa, diz quantos, e nada é gravado — atualize a página e marque de novo.</w:t>
+      </w:r>
+    </w:p>
+    <w:p>
+      <w:pPr>
+        <w:spacing w:after="140" w:line="280"/>
+      </w:pPr>
+      <w:r>
+        <w:rPr>
+          <w:color w:val="23293D"/>
+          <w:sz w:val="21"/>
+          <w:szCs w:val="21"/>
+        </w:rPr>
+        <w:t xml:space="preserve">Para mudar um que já tem, use o </w:t>
       </w:r>
       <w:r>
         <w:rPr>
@@ -22170,7 +22327,7 @@
           <w:sz w:val="21"/>
           <w:szCs w:val="21"/>
         </w:rPr>
-        <w:t xml:space="preserve"> da linha. Com todos incluídos, o botão diz </w:t>
+        <w:t xml:space="preserve"> da linha (um por vez, o procedimento não muda). Com todos incluídos, o botão diz </w:t>
       </w:r>
       <w:r>
         <w:rPr>

</xml_diff>

<commit_message>
fix(empresarial): o funil mostra e soma o valor da proposta salva, não só o estimado (OC-00011, v0.92.1)
O card e a soma da etapa liam só o Valor estimado digitado no cadastro; salvar a proposta nunca o alimentava. Agora o valor vem da mesma conta do documento, calculado na leitura; sem preço gravado, vale o estimado. Painéis e ficha usam a mesma conta.

Co-Authored-By: Claude Opus 5.5 <noreply@anthropic.com>
</commit_message>
<xml_diff>
--- a/docs/treinamento/Manual-Risarte-Empresarial.docx
+++ b/docs/treinamento/Manual-Risarte-Empresarial.docx
@@ -180,7 +180,7 @@
           <w:sz w:val="20"/>
           <w:szCs w:val="20"/>
         </w:rPr>
-        <w:t xml:space="preserve">28 de outubro de 2026</w:t>
+        <w:t xml:space="preserve">30 de outubro de 2026</w:t>
       </w:r>
     </w:p>
     <w:p>
@@ -2628,6 +2628,166 @@
                 <w:szCs w:val="20"/>
               </w:rPr>
               <w:t xml:space="preserve">Fechou e está entrando no ar</w:t>
+            </w:r>
+          </w:p>
+        </w:tc>
+      </w:tr>
+    </w:tbl>
+    <w:p>
+      <w:pPr>
+        <w:spacing w:after="140" w:line="120"/>
+      </w:pPr>
+      <w:r>
+        <w:rPr>
+          <w:sz w:val="2"/>
+          <w:szCs w:val="2"/>
+        </w:rPr>
+        <w:t xml:space="preserve"/>
+      </w:r>
+    </w:p>
+    <w:p>
+      <w:pPr>
+        <w:spacing w:after="140" w:line="280"/>
+      </w:pPr>
+      <w:r>
+        <w:rPr>
+          <w:b/>
+          <w:bCs/>
+          <w:color w:val="23293D"/>
+          <w:sz w:val="21"/>
+          <w:szCs w:val="21"/>
+        </w:rPr>
+        <w:t xml:space="preserve">O valor no card e a soma da etapa.</w:t>
+      </w:r>
+      <w:r>
+        <w:rPr>
+          <w:color w:val="23293D"/>
+          <w:sz w:val="21"/>
+          <w:szCs w:val="21"/>
+        </w:rPr>
+        <w:t xml:space="preserve"> Assim que a proposta tem preço salvo, o card mostra a </w:t>
+      </w:r>
+      <w:r>
+        <w:rPr>
+          <w:b/>
+          <w:bCs/>
+          <w:color w:val="23293D"/>
+          <w:sz w:val="21"/>
+          <w:szCs w:val="21"/>
+        </w:rPr>
+        <w:t xml:space="preserve">mensalidade da proposta</w:t>
+      </w:r>
+      <w:r>
+        <w:rPr>
+          <w:color w:val="23293D"/>
+          <w:sz w:val="21"/>
+          <w:szCs w:val="21"/>
+        </w:rPr>
+        <w:t xml:space="preserve"> (</w:t>
+      </w:r>
+      <w:r>
+        <w:rPr>
+          <w:i/>
+          <w:iCs/>
+          <w:color w:val="23293D"/>
+          <w:sz w:val="21"/>
+          <w:szCs w:val="21"/>
+        </w:rPr>
+        <w:t xml:space="preserve">"R$ 524,40/mês"</w:t>
+      </w:r>
+      <w:r>
+        <w:rPr>
+          <w:color w:val="23293D"/>
+          <w:sz w:val="21"/>
+          <w:szCs w:val="21"/>
+        </w:rPr>
+        <w:t xml:space="preserve">, a mesma do documento, com faixas e dependentes calculados) e a etapa soma esses valores. Antes disso, vale o </w:t>
+      </w:r>
+      <w:r>
+        <w:rPr>
+          <w:b/>
+          <w:bCs/>
+          <w:color w:val="23293D"/>
+          <w:sz w:val="21"/>
+          <w:szCs w:val="21"/>
+        </w:rPr>
+        <w:t xml:space="preserve">valor estimado</w:t>
+      </w:r>
+      <w:r>
+        <w:rPr>
+          <w:color w:val="23293D"/>
+          <w:sz w:val="21"/>
+          <w:szCs w:val="21"/>
+        </w:rPr>
+        <w:t xml:space="preserve"> do cadastro (</w:t>
+      </w:r>
+      <w:r>
+        <w:rPr>
+          <w:i/>
+          <w:iCs/>
+          <w:color w:val="23293D"/>
+          <w:sz w:val="21"/>
+          <w:szCs w:val="21"/>
+        </w:rPr>
+        <w:t xml:space="preserve">"(estimado)"</w:t>
+      </w:r>
+      <w:r>
+        <w:rPr>
+          <w:color w:val="23293D"/>
+          <w:sz w:val="21"/>
+          <w:szCs w:val="21"/>
+        </w:rPr>
+        <w:t xml:space="preserve">). Mudou a proposta, o funil muda junto. Os painéis do funil usam a mesma conta.</w:t>
+      </w:r>
+    </w:p>
+    <w:tbl>
+      <w:tblPr>
+        <w:tblW w:type="dxa" w:w="9638"/>
+        <w:tblBorders>
+          <w:top w:val="single" w:color="F5F3EC" w:sz="2"/>
+          <w:left w:val="single" w:color="B98B2E" w:sz="18"/>
+          <w:bottom w:val="single" w:color="F5F3EC" w:sz="2"/>
+          <w:right w:val="single" w:color="F5F3EC" w:sz="2"/>
+          <w:insideH w:val="none" w:color="auto" w:sz="0"/>
+          <w:insideV w:val="none" w:color="auto" w:sz="0"/>
+        </w:tblBorders>
+      </w:tblPr>
+      <w:tblGrid>
+        <w:gridCol w:w="9638"/>
+      </w:tblGrid>
+      <w:tr>
+        <w:tc>
+          <w:tcPr>
+            <w:tcW w:type="dxa" w:w="9638"/>
+            <w:shd w:fill="F5F3EC" w:color="auto" w:val="clear"/>
+            <w:tcMar>
+              <w:top w:type="dxa" w:w="160"/>
+              <w:left w:type="dxa" w:w="220"/>
+              <w:bottom w:type="dxa" w:w="160"/>
+              <w:right w:type="dxa" w:w="200"/>
+            </w:tcMar>
+          </w:tcPr>
+          <w:p>
+            <w:pPr>
+              <w:spacing w:after="140" w:line="280"/>
+            </w:pPr>
+            <w:r>
+              <w:rPr>
+                <w:b/>
+                <w:bCs/>
+                <w:color w:val="23293D"/>
+                <w:sz w:val="21"/>
+                <w:szCs w:val="21"/>
+              </w:rPr>
+              <w:t xml:space="preserve">A soma é de valores por mês.</w:t>
+            </w:r>
+            <w:r>
+              <w:rPr>
+                <w:color w:val="23293D"/>
+                <w:sz w:val="21"/>
+                <w:szCs w:val="21"/>
+              </w:rPr>
+              <w:t xml:space="preserve"> Ela não inclui a implantação.</w:t>
             </w:r>
           </w:p>
         </w:tc>

</xml_diff>